<commit_message>
chore: complete prisma removal and initialize supabase helpers
</commit_message>
<xml_diff>
--- a/docs/คู่มือการใช้งาน IT Asset Tracker.docx
+++ b/docs/คู่มือการใช้งาน IT Asset Tracker.docx
@@ -73,7 +73,7 @@
           <w:sz w:val="22"/>
           <w:szCs w:val="22"/>
         </w:rPr>
-        <w:t xml:space="preserve">เวอร์ชัน 1.0  |  18 เมษายน 2569</w:t>
+        <w:t xml:space="preserve">เวอร์ชัน 1.0  |  21 เมษายน 2569</w:t>
       </w:r>
     </w:p>
     <w:p>
@@ -399,7 +399,7 @@
           <w:sz w:val="22"/>
           <w:szCs w:val="22"/>
         </w:rPr>
-        <w:t xml:space="preserve">ระบบใช้การยืนยันตัวตนด้วย Email และ Password ไม่ต้องติดตั้งแอปพลิเคชันใดเพิ่มเติม สามารถใช้งานผ่านเบราว์เซอร์ได้ทันที</w:t>
+        <w:t xml:space="preserve">ระบบใช้การยืนยันตัวตนแบบ Hybrid Auth รองรับทั้ง Email + Password และ Magic Link สำหรับผู้ใช้ที่มีบัญชีอยู่แล้ว โดยไม่ต้องติดตั้งแอปพลิเคชันเพิ่มเติม และสามารถใช้งานผ่านเบราว์เซอร์ได้ทันที</w:t>
       </w:r>
     </w:p>
     <w:p>
@@ -459,7 +459,7 @@
           <w:sz w:val="22"/>
           <w:szCs w:val="22"/>
         </w:rPr>
-        <w:t xml:space="preserve">กรอก Password ในช่อง "Password"</w:t>
+        <w:t xml:space="preserve">หากต้องการเข้าสู่ระบบด้วยรหัสผ่าน ให้กรอก Password ในช่อง "Password" แล้วคลิกปุ่ม "Sign in"</w:t>
       </w:r>
     </w:p>
     <w:p>
@@ -476,7 +476,7 @@
           <w:sz w:val="22"/>
           <w:szCs w:val="22"/>
         </w:rPr>
-        <w:t xml:space="preserve">คลิกปุ่ม "Sign in"</w:t>
+        <w:t xml:space="preserve">หากต้องการเข้าสู่ระบบแบบไม่ใช้รหัสผ่าน ให้คลิกปุ่ม "Send magic link" และเปิดลิงก์จากอีเมลที่ได้รับ</w:t>
       </w:r>
     </w:p>
     <w:p>
@@ -493,7 +493,24 @@
           <w:sz w:val="22"/>
           <w:szCs w:val="22"/>
         </w:rPr>
-        <w:t xml:space="preserve">หากข้อมูลถูกต้อง ระบบจะพาไปยังหน้า Dashboard ทันที</w:t>
+        <w:t xml:space="preserve">Magic Link ใช้ได้เฉพาะบัญชีที่มีอยู่แล้วในระบบ</w:t>
+      </w:r>
+    </w:p>
+    <w:p>
+      <w:pPr>
+        <w:pStyle w:val="ListParagraph"/>
+        <w:numPr>
+          <w:ilvl w:val="0"/>
+          <w:numId w:val="1"/>
+        </w:numPr>
+        <w:spacing w:after="80"/>
+      </w:pPr>
+      <w:r>
+        <w:rPr>
+          <w:sz w:val="22"/>
+          <w:szCs w:val="22"/>
+        </w:rPr>
+        <w:t xml:space="preserve">เมื่อยืนยันตัวตนสำเร็จ ระบบจะพาไปยังหน้า Dashboard ทันที</w:t>
       </w:r>
     </w:p>
     <w:p>
@@ -4276,7 +4293,7 @@
           <w:sz w:val="22"/>
           <w:szCs w:val="22"/>
         </w:rPr>
-        <w:t xml:space="preserve">A: ติดต่อ Admin เพื่อรีเซ็ต Password ผ่านฐานข้อมูลโดยตรง ระบบเวอร์ชันนี้ยังไม่มีฟังก์ชัน "Forgot Password" ในหน้าเว็บ</w:t>
+        <w:t xml:space="preserve">A: หากบัญชีของคุณมีอีเมลอยู่ในระบบ สามารถใช้ Magic Link เพื่อเข้าสู่ระบบได้ทันทีในกรณีที่ไม่สะดวกรหัสผ่าน หากยังต้องการรีเซ็ต Password ให้ติดต่อ Admin โดยตรง เนื่องจากระบบยังไม่มีฟังก์ชัน "Forgot Password" แบบ self-service ในหน้าเว็บ</w:t>
       </w:r>
     </w:p>
     <w:p>

</xml_diff>